<commit_message>
docs: append 手机端WorkBuddy note to README.docx
</commit_message>
<xml_diff>
--- a/README.docx
+++ b/README.docx
@@ -2337,6 +2337,14 @@
       <w:pgSz w:w="11906" w:h="16838"/>
       <w:pgMar w:top="1440" w:right="1800" w:bottom="1440" w:left="1800" w:header="851" w:footer="992" w:gutter="0"/>
     </w:sectPr>
+    <w:p>
+      <w:pPr>
+        <w:pStyle w:val="Normal"/>
+      </w:pPr>
+      <w:r>
+        <w:t xml:space="preserve">（手机端 WorkBuddy 查询商标方法 · mobile WorkBuddy trademark-checker，与 PC 端版本区分，勿混淆）</w:t>
+      </w:r>
+    </w:p>
   </w:body>
 </w:document>
 </file>

</xml_diff>